<commit_message>
feat(copropiedades): alinear formato integral con slip humano de suscripcion (36 coberturas, 19 deducibles, 22 asistencias, specs edificio)
</commit_message>
<xml_diff>
--- a/assets/layouts/Copropiedades.docx
+++ b/assets/layouts/Copropiedades.docx
@@ -1085,75 +1085,33 @@
             <w:tcW w:w="2484" w:type="dxa"/>
           </w:tcPr>
           <w:p>
-            <w:pPr>
-              <w:rPr>
-                <w:rFonts w:ascii="Aptos" w:hAnsi="Aptos"/>
-              </w:rPr>
-            </w:pPr>
             <w:r>
-              <w:rPr>
-                <w:rFonts w:ascii="Aptos" w:hAnsi="Aptos"/>
-              </w:rPr>
-              <w:t xml:space="preserve">Modulo </w:t>
+              <w:t>Modulo básico de incendio</w:t>
             </w:r>
-            <w:proofErr w:type="spellStart"/>
-            <w:r>
-              <w:rPr>
-                <w:rFonts w:ascii="Aptos" w:hAnsi="Aptos"/>
-              </w:rPr>
-              <w:t>básico</w:t>
-            </w:r>
-            <w:proofErr w:type="spellEnd"/>
-            <w:r>
-              <w:rPr>
-                <w:rFonts w:ascii="Aptos" w:hAnsi="Aptos"/>
-              </w:rPr>
-              <w:t xml:space="preserve"> de </w:t>
-            </w:r>
-            <w:proofErr w:type="spellStart"/>
-            <w:r>
-              <w:rPr>
-                <w:rFonts w:ascii="Aptos" w:hAnsi="Aptos"/>
-              </w:rPr>
-              <w:t>incendio</w:t>
-            </w:r>
-            <w:proofErr w:type="spellEnd"/>
-          </w:p>
-        </w:tc>
-        <w:tc>
-          <w:tcPr>
-            <w:tcW w:w="2484" w:type="dxa"/>
-          </w:tcPr>
-          <w:p>
-            <w:pPr>
-              <w:rPr>
-                <w:rFonts w:ascii="Aptos" w:hAnsi="Aptos"/>
-              </w:rPr>
-            </w:pPr>
-          </w:p>
-        </w:tc>
-        <w:tc>
-          <w:tcPr>
-            <w:tcW w:w="2484" w:type="dxa"/>
-          </w:tcPr>
-          <w:p>
-            <w:pPr>
-              <w:rPr>
-                <w:rFonts w:ascii="Aptos" w:hAnsi="Aptos"/>
-              </w:rPr>
-            </w:pPr>
-          </w:p>
-        </w:tc>
-        <w:tc>
-          <w:tcPr>
-            <w:tcW w:w="2484" w:type="dxa"/>
-          </w:tcPr>
-          <w:p>
-            <w:pPr>
-              <w:rPr>
-                <w:rFonts w:ascii="Aptos" w:hAnsi="Aptos"/>
-              </w:rPr>
-            </w:pPr>
+          </w:p>
+        </w:tc>
+        <w:tc>
+          <w:tcPr>
+            <w:tcW w:w="2484" w:type="dxa"/>
+          </w:tcPr>
+          <w:p>
+            <w:r/>
+          </w:p>
+        </w:tc>
+        <w:tc>
+          <w:tcPr>
+            <w:tcW w:w="2484" w:type="dxa"/>
+          </w:tcPr>
+          <w:p>
+            <w:r/>
+          </w:p>
+        </w:tc>
+        <w:tc>
+          <w:tcPr>
+            <w:tcW w:w="2484" w:type="dxa"/>
+          </w:tcPr>
+          <w:p>
+            <w:r/>
           </w:p>
         </w:tc>
       </w:tr>
@@ -1163,18 +1121,8 @@
             <w:tcW w:w="2484" w:type="dxa"/>
           </w:tcPr>
           <w:p>
-            <w:pPr>
-              <w:rPr>
-                <w:rFonts w:ascii="Aptos" w:hAnsi="Aptos"/>
-                <w:lang w:val="es-CO"/>
-              </w:rPr>
-            </w:pPr>
             <w:r>
-              <w:rPr>
-                <w:rFonts w:ascii="Aptos" w:hAnsi="Aptos"/>
-                <w:lang w:val="es-CO"/>
-              </w:rPr>
-              <w:t>Incendio y/o rayo, Explosión, Daños por agua, Anegación</w:t>
+              <w:t>Incendio y/o rayo, Explosión, Daños por agua, Anegación, deslizamiento y avalancha, Extended coverage, Terremoto, temblor y/o erupción volcánica, HMACC, AMIT</w:t>
             </w:r>
           </w:p>
         </w:tc>
@@ -1183,35 +1131,23 @@
             <w:tcW w:w="2484" w:type="dxa"/>
           </w:tcPr>
           <w:p>
-            <w:pPr>
-              <w:rPr>
-                <w:rFonts w:ascii="Aptos" w:hAnsi="Aptos"/>
-              </w:rPr>
-            </w:pPr>
-          </w:p>
-        </w:tc>
-        <w:tc>
-          <w:tcPr>
-            <w:tcW w:w="2484" w:type="dxa"/>
-          </w:tcPr>
-          <w:p>
-            <w:pPr>
-              <w:rPr>
-                <w:rFonts w:ascii="Aptos" w:hAnsi="Aptos"/>
-              </w:rPr>
-            </w:pPr>
-          </w:p>
-        </w:tc>
-        <w:tc>
-          <w:tcPr>
-            <w:tcW w:w="2484" w:type="dxa"/>
-          </w:tcPr>
-          <w:p>
-            <w:pPr>
-              <w:rPr>
-                <w:rFonts w:ascii="Aptos" w:hAnsi="Aptos"/>
-              </w:rPr>
-            </w:pPr>
+            <w:r/>
+          </w:p>
+        </w:tc>
+        <w:tc>
+          <w:tcPr>
+            <w:tcW w:w="2484" w:type="dxa"/>
+          </w:tcPr>
+          <w:p>
+            <w:r/>
+          </w:p>
+        </w:tc>
+        <w:tc>
+          <w:tcPr>
+            <w:tcW w:w="2484" w:type="dxa"/>
+          </w:tcPr>
+          <w:p>
+            <w:r/>
           </w:p>
         </w:tc>
       </w:tr>
@@ -1221,18 +1157,8 @@
             <w:tcW w:w="2484" w:type="dxa"/>
           </w:tcPr>
           <w:p>
-            <w:pPr>
-              <w:rPr>
-                <w:rFonts w:ascii="Aptos" w:hAnsi="Aptos"/>
-                <w:lang w:val="es-CO"/>
-              </w:rPr>
-            </w:pPr>
             <w:r>
-              <w:rPr>
-                <w:rFonts w:ascii="Aptos" w:hAnsi="Aptos"/>
-                <w:lang w:val="es-CO"/>
-              </w:rPr>
-              <w:t>Terremoto, temblor y/o erupción volcánica, HMACC, AMIT</w:t>
+              <w:t>Rotura de vidrios</w:t>
             </w:r>
           </w:p>
         </w:tc>
@@ -1241,35 +1167,23 @@
             <w:tcW w:w="2484" w:type="dxa"/>
           </w:tcPr>
           <w:p>
-            <w:pPr>
-              <w:rPr>
-                <w:rFonts w:ascii="Aptos" w:hAnsi="Aptos"/>
-              </w:rPr>
-            </w:pPr>
-          </w:p>
-        </w:tc>
-        <w:tc>
-          <w:tcPr>
-            <w:tcW w:w="2484" w:type="dxa"/>
-          </w:tcPr>
-          <w:p>
-            <w:pPr>
-              <w:rPr>
-                <w:rFonts w:ascii="Aptos" w:hAnsi="Aptos"/>
-              </w:rPr>
-            </w:pPr>
-          </w:p>
-        </w:tc>
-        <w:tc>
-          <w:tcPr>
-            <w:tcW w:w="2484" w:type="dxa"/>
-          </w:tcPr>
-          <w:p>
-            <w:pPr>
-              <w:rPr>
-                <w:rFonts w:ascii="Aptos" w:hAnsi="Aptos"/>
-              </w:rPr>
-            </w:pPr>
+            <w:r/>
+          </w:p>
+        </w:tc>
+        <w:tc>
+          <w:tcPr>
+            <w:tcW w:w="2484" w:type="dxa"/>
+          </w:tcPr>
+          <w:p>
+            <w:r/>
+          </w:p>
+        </w:tc>
+        <w:tc>
+          <w:tcPr>
+            <w:tcW w:w="2484" w:type="dxa"/>
+          </w:tcPr>
+          <w:p>
+            <w:r/>
           </w:p>
         </w:tc>
       </w:tr>
@@ -1279,16 +1193,8 @@
             <w:tcW w:w="2484" w:type="dxa"/>
           </w:tcPr>
           <w:p>
-            <w:pPr>
-              <w:rPr>
-                <w:rFonts w:ascii="Aptos" w:hAnsi="Aptos"/>
-              </w:rPr>
-            </w:pPr>
             <w:r>
-              <w:rPr>
-                <w:rFonts w:ascii="Aptos" w:hAnsi="Aptos"/>
-              </w:rPr>
-              <w:t>Rotura de vidrios</w:t>
+              <w:t>Pago cuotas de Administración</w:t>
             </w:r>
           </w:p>
         </w:tc>
@@ -1297,35 +1203,23 @@
             <w:tcW w:w="2484" w:type="dxa"/>
           </w:tcPr>
           <w:p>
-            <w:pPr>
-              <w:rPr>
-                <w:rFonts w:ascii="Aptos" w:hAnsi="Aptos"/>
-              </w:rPr>
-            </w:pPr>
-          </w:p>
-        </w:tc>
-        <w:tc>
-          <w:tcPr>
-            <w:tcW w:w="2484" w:type="dxa"/>
-          </w:tcPr>
-          <w:p>
-            <w:pPr>
-              <w:rPr>
-                <w:rFonts w:ascii="Aptos" w:hAnsi="Aptos"/>
-              </w:rPr>
-            </w:pPr>
-          </w:p>
-        </w:tc>
-        <w:tc>
-          <w:tcPr>
-            <w:tcW w:w="2484" w:type="dxa"/>
-          </w:tcPr>
-          <w:p>
-            <w:pPr>
-              <w:rPr>
-                <w:rFonts w:ascii="Aptos" w:hAnsi="Aptos"/>
-              </w:rPr>
-            </w:pPr>
+            <w:r/>
+          </w:p>
+        </w:tc>
+        <w:tc>
+          <w:tcPr>
+            <w:tcW w:w="2484" w:type="dxa"/>
+          </w:tcPr>
+          <w:p>
+            <w:r/>
+          </w:p>
+        </w:tc>
+        <w:tc>
+          <w:tcPr>
+            <w:tcW w:w="2484" w:type="dxa"/>
+          </w:tcPr>
+          <w:p>
+            <w:r/>
           </w:p>
         </w:tc>
       </w:tr>
@@ -1335,16 +1229,8 @@
             <w:tcW w:w="2484" w:type="dxa"/>
           </w:tcPr>
           <w:p>
-            <w:pPr>
-              <w:rPr>
-                <w:rFonts w:ascii="Aptos" w:hAnsi="Aptos"/>
-              </w:rPr>
-            </w:pPr>
             <w:r>
-              <w:rPr>
-                <w:rFonts w:ascii="Aptos" w:hAnsi="Aptos"/>
-              </w:rPr>
-              <w:t>Pago cuotas de Administración</w:t>
+              <w:t>Remoción de escombros</w:t>
             </w:r>
           </w:p>
         </w:tc>
@@ -1353,35 +1239,23 @@
             <w:tcW w:w="2484" w:type="dxa"/>
           </w:tcPr>
           <w:p>
-            <w:pPr>
-              <w:rPr>
-                <w:rFonts w:ascii="Aptos" w:hAnsi="Aptos"/>
-              </w:rPr>
-            </w:pPr>
-          </w:p>
-        </w:tc>
-        <w:tc>
-          <w:tcPr>
-            <w:tcW w:w="2484" w:type="dxa"/>
-          </w:tcPr>
-          <w:p>
-            <w:pPr>
-              <w:rPr>
-                <w:rFonts w:ascii="Aptos" w:hAnsi="Aptos"/>
-              </w:rPr>
-            </w:pPr>
-          </w:p>
-        </w:tc>
-        <w:tc>
-          <w:tcPr>
-            <w:tcW w:w="2484" w:type="dxa"/>
-          </w:tcPr>
-          <w:p>
-            <w:pPr>
-              <w:rPr>
-                <w:rFonts w:ascii="Aptos" w:hAnsi="Aptos"/>
-              </w:rPr>
-            </w:pPr>
+            <w:r/>
+          </w:p>
+        </w:tc>
+        <w:tc>
+          <w:tcPr>
+            <w:tcW w:w="2484" w:type="dxa"/>
+          </w:tcPr>
+          <w:p>
+            <w:r/>
+          </w:p>
+        </w:tc>
+        <w:tc>
+          <w:tcPr>
+            <w:tcW w:w="2484" w:type="dxa"/>
+          </w:tcPr>
+          <w:p>
+            <w:r/>
           </w:p>
         </w:tc>
       </w:tr>
@@ -1391,16 +1265,8 @@
             <w:tcW w:w="2484" w:type="dxa"/>
           </w:tcPr>
           <w:p>
-            <w:pPr>
-              <w:rPr>
-                <w:rFonts w:ascii="Aptos" w:hAnsi="Aptos"/>
-              </w:rPr>
-            </w:pPr>
             <w:r>
-              <w:rPr>
-                <w:rFonts w:ascii="Aptos" w:hAnsi="Aptos"/>
-              </w:rPr>
-              <w:t>Remoción de escombros</w:t>
+              <w:t>Bienes a la intemperie</w:t>
             </w:r>
           </w:p>
         </w:tc>
@@ -1409,35 +1275,23 @@
             <w:tcW w:w="2484" w:type="dxa"/>
           </w:tcPr>
           <w:p>
-            <w:pPr>
-              <w:rPr>
-                <w:rFonts w:ascii="Aptos" w:hAnsi="Aptos"/>
-              </w:rPr>
-            </w:pPr>
-          </w:p>
-        </w:tc>
-        <w:tc>
-          <w:tcPr>
-            <w:tcW w:w="2484" w:type="dxa"/>
-          </w:tcPr>
-          <w:p>
-            <w:pPr>
-              <w:rPr>
-                <w:rFonts w:ascii="Aptos" w:hAnsi="Aptos"/>
-              </w:rPr>
-            </w:pPr>
-          </w:p>
-        </w:tc>
-        <w:tc>
-          <w:tcPr>
-            <w:tcW w:w="2484" w:type="dxa"/>
-          </w:tcPr>
-          <w:p>
-            <w:pPr>
-              <w:rPr>
-                <w:rFonts w:ascii="Aptos" w:hAnsi="Aptos"/>
-              </w:rPr>
-            </w:pPr>
+            <w:r/>
+          </w:p>
+        </w:tc>
+        <w:tc>
+          <w:tcPr>
+            <w:tcW w:w="2484" w:type="dxa"/>
+          </w:tcPr>
+          <w:p>
+            <w:r/>
+          </w:p>
+        </w:tc>
+        <w:tc>
+          <w:tcPr>
+            <w:tcW w:w="2484" w:type="dxa"/>
+          </w:tcPr>
+          <w:p>
+            <w:r/>
           </w:p>
         </w:tc>
       </w:tr>
@@ -1447,67 +1301,33 @@
             <w:tcW w:w="2484" w:type="dxa"/>
           </w:tcPr>
           <w:p>
-            <w:pPr>
-              <w:rPr>
-                <w:rFonts w:ascii="Aptos" w:hAnsi="Aptos"/>
-                <w:lang w:val="es-CO"/>
-              </w:rPr>
-            </w:pPr>
-            <w:proofErr w:type="spellStart"/>
             <w:r>
-              <w:rPr>
-                <w:rFonts w:ascii="Aptos" w:hAnsi="Aptos"/>
-                <w:lang w:val="es-CO"/>
-              </w:rPr>
-              <w:t>Modulo</w:t>
+              <w:t>Actos de autoridad</w:t>
             </w:r>
-            <w:proofErr w:type="spellEnd"/>
-            <w:r>
-              <w:rPr>
-                <w:rFonts w:ascii="Aptos" w:hAnsi="Aptos"/>
-                <w:lang w:val="es-CO"/>
-              </w:rPr>
-              <w:t xml:space="preserve"> de Maquinaria y Equipo</w:t>
-            </w:r>
-          </w:p>
-        </w:tc>
-        <w:tc>
-          <w:tcPr>
-            <w:tcW w:w="2484" w:type="dxa"/>
-          </w:tcPr>
-          <w:p>
-            <w:pPr>
-              <w:rPr>
-                <w:rFonts w:ascii="Aptos" w:hAnsi="Aptos"/>
-                <w:lang w:val="es-CO"/>
-              </w:rPr>
-            </w:pPr>
-          </w:p>
-        </w:tc>
-        <w:tc>
-          <w:tcPr>
-            <w:tcW w:w="2484" w:type="dxa"/>
-          </w:tcPr>
-          <w:p>
-            <w:pPr>
-              <w:rPr>
-                <w:rFonts w:ascii="Aptos" w:hAnsi="Aptos"/>
-                <w:lang w:val="es-CO"/>
-              </w:rPr>
-            </w:pPr>
-          </w:p>
-        </w:tc>
-        <w:tc>
-          <w:tcPr>
-            <w:tcW w:w="2484" w:type="dxa"/>
-          </w:tcPr>
-          <w:p>
-            <w:pPr>
-              <w:rPr>
-                <w:rFonts w:ascii="Aptos" w:hAnsi="Aptos"/>
-                <w:lang w:val="es-CO"/>
-              </w:rPr>
-            </w:pPr>
+          </w:p>
+        </w:tc>
+        <w:tc>
+          <w:tcPr>
+            <w:tcW w:w="2484" w:type="dxa"/>
+          </w:tcPr>
+          <w:p>
+            <w:r/>
+          </w:p>
+        </w:tc>
+        <w:tc>
+          <w:tcPr>
+            <w:tcW w:w="2484" w:type="dxa"/>
+          </w:tcPr>
+          <w:p>
+            <w:r/>
+          </w:p>
+        </w:tc>
+        <w:tc>
+          <w:tcPr>
+            <w:tcW w:w="2484" w:type="dxa"/>
+          </w:tcPr>
+          <w:p>
+            <w:r/>
           </w:p>
         </w:tc>
       </w:tr>
@@ -1517,17 +1337,115 @@
             <w:tcW w:w="2484" w:type="dxa"/>
           </w:tcPr>
           <w:p>
-            <w:pPr>
-              <w:rPr>
-                <w:rFonts w:ascii="Aptos" w:hAnsi="Aptos"/>
-                <w:lang w:val="es-CO"/>
-              </w:rPr>
-            </w:pPr>
             <w:r>
-              <w:rPr>
-                <w:rFonts w:ascii="Aptos" w:hAnsi="Aptos"/>
-                <w:lang w:val="es-CO"/>
-              </w:rPr>
+              <w:t>Honorarios de abogados</w:t>
+            </w:r>
+          </w:p>
+        </w:tc>
+        <w:tc>
+          <w:tcPr>
+            <w:tcW w:w="2484" w:type="dxa"/>
+          </w:tcPr>
+          <w:p>
+            <w:r/>
+          </w:p>
+        </w:tc>
+        <w:tc>
+          <w:tcPr>
+            <w:tcW w:w="2484" w:type="dxa"/>
+          </w:tcPr>
+          <w:p>
+            <w:r/>
+          </w:p>
+        </w:tc>
+        <w:tc>
+          <w:tcPr>
+            <w:tcW w:w="2484" w:type="dxa"/>
+          </w:tcPr>
+          <w:p>
+            <w:r/>
+          </w:p>
+        </w:tc>
+      </w:tr>
+      <w:tr>
+        <w:tc>
+          <w:tcPr>
+            <w:tcW w:w="2484" w:type="dxa"/>
+          </w:tcPr>
+          <w:p>
+            <w:r>
+              <w:t>Índice variable</w:t>
+            </w:r>
+          </w:p>
+        </w:tc>
+        <w:tc>
+          <w:tcPr>
+            <w:tcW w:w="2484" w:type="dxa"/>
+          </w:tcPr>
+          <w:p>
+            <w:r/>
+          </w:p>
+        </w:tc>
+        <w:tc>
+          <w:tcPr>
+            <w:tcW w:w="2484" w:type="dxa"/>
+          </w:tcPr>
+          <w:p>
+            <w:r/>
+          </w:p>
+        </w:tc>
+        <w:tc>
+          <w:tcPr>
+            <w:tcW w:w="2484" w:type="dxa"/>
+          </w:tcPr>
+          <w:p>
+            <w:r/>
+          </w:p>
+        </w:tc>
+      </w:tr>
+      <w:tr>
+        <w:tc>
+          <w:tcPr>
+            <w:tcW w:w="2484" w:type="dxa"/>
+          </w:tcPr>
+          <w:p>
+            <w:r>
+              <w:t>Modulo de Maquinaria y Equipo</w:t>
+            </w:r>
+          </w:p>
+        </w:tc>
+        <w:tc>
+          <w:tcPr>
+            <w:tcW w:w="2484" w:type="dxa"/>
+          </w:tcPr>
+          <w:p>
+            <w:r/>
+          </w:p>
+        </w:tc>
+        <w:tc>
+          <w:tcPr>
+            <w:tcW w:w="2484" w:type="dxa"/>
+          </w:tcPr>
+          <w:p>
+            <w:r/>
+          </w:p>
+        </w:tc>
+        <w:tc>
+          <w:tcPr>
+            <w:tcW w:w="2484" w:type="dxa"/>
+          </w:tcPr>
+          <w:p>
+            <w:r/>
+          </w:p>
+        </w:tc>
+      </w:tr>
+      <w:tr>
+        <w:tc>
+          <w:tcPr>
+            <w:tcW w:w="2484" w:type="dxa"/>
+          </w:tcPr>
+          <w:p>
+            <w:r>
               <w:t>Rotura de maquinaria (daño interno)</w:t>
             </w:r>
           </w:p>
@@ -1537,35 +1455,23 @@
             <w:tcW w:w="2484" w:type="dxa"/>
           </w:tcPr>
           <w:p>
-            <w:pPr>
-              <w:rPr>
-                <w:rFonts w:ascii="Aptos" w:hAnsi="Aptos"/>
-              </w:rPr>
-            </w:pPr>
-          </w:p>
-        </w:tc>
-        <w:tc>
-          <w:tcPr>
-            <w:tcW w:w="2484" w:type="dxa"/>
-          </w:tcPr>
-          <w:p>
-            <w:pPr>
-              <w:rPr>
-                <w:rFonts w:ascii="Aptos" w:hAnsi="Aptos"/>
-              </w:rPr>
-            </w:pPr>
-          </w:p>
-        </w:tc>
-        <w:tc>
-          <w:tcPr>
-            <w:tcW w:w="2484" w:type="dxa"/>
-          </w:tcPr>
-          <w:p>
-            <w:pPr>
-              <w:rPr>
-                <w:rFonts w:ascii="Aptos" w:hAnsi="Aptos"/>
-              </w:rPr>
-            </w:pPr>
+            <w:r/>
+          </w:p>
+        </w:tc>
+        <w:tc>
+          <w:tcPr>
+            <w:tcW w:w="2484" w:type="dxa"/>
+          </w:tcPr>
+          <w:p>
+            <w:r/>
+          </w:p>
+        </w:tc>
+        <w:tc>
+          <w:tcPr>
+            <w:tcW w:w="2484" w:type="dxa"/>
+          </w:tcPr>
+          <w:p>
+            <w:r/>
           </w:p>
         </w:tc>
       </w:tr>
@@ -1575,15 +1481,7 @@
             <w:tcW w:w="2484" w:type="dxa"/>
           </w:tcPr>
           <w:p>
-            <w:pPr>
-              <w:rPr>
-                <w:rFonts w:ascii="Aptos" w:hAnsi="Aptos"/>
-              </w:rPr>
-            </w:pPr>
             <w:r>
-              <w:rPr>
-                <w:rFonts w:ascii="Aptos" w:hAnsi="Aptos"/>
-              </w:rPr>
               <w:t>Sustracción con violencia</w:t>
             </w:r>
           </w:p>
@@ -1593,35 +1491,23 @@
             <w:tcW w:w="2484" w:type="dxa"/>
           </w:tcPr>
           <w:p>
-            <w:pPr>
-              <w:rPr>
-                <w:rFonts w:ascii="Aptos" w:hAnsi="Aptos"/>
-              </w:rPr>
-            </w:pPr>
-          </w:p>
-        </w:tc>
-        <w:tc>
-          <w:tcPr>
-            <w:tcW w:w="2484" w:type="dxa"/>
-          </w:tcPr>
-          <w:p>
-            <w:pPr>
-              <w:rPr>
-                <w:rFonts w:ascii="Aptos" w:hAnsi="Aptos"/>
-              </w:rPr>
-            </w:pPr>
-          </w:p>
-        </w:tc>
-        <w:tc>
-          <w:tcPr>
-            <w:tcW w:w="2484" w:type="dxa"/>
-          </w:tcPr>
-          <w:p>
-            <w:pPr>
-              <w:rPr>
-                <w:rFonts w:ascii="Aptos" w:hAnsi="Aptos"/>
-              </w:rPr>
-            </w:pPr>
+            <w:r/>
+          </w:p>
+        </w:tc>
+        <w:tc>
+          <w:tcPr>
+            <w:tcW w:w="2484" w:type="dxa"/>
+          </w:tcPr>
+          <w:p>
+            <w:r/>
+          </w:p>
+        </w:tc>
+        <w:tc>
+          <w:tcPr>
+            <w:tcW w:w="2484" w:type="dxa"/>
+          </w:tcPr>
+          <w:p>
+            <w:r/>
           </w:p>
         </w:tc>
       </w:tr>
@@ -1631,15 +1517,547 @@
             <w:tcW w:w="2484" w:type="dxa"/>
           </w:tcPr>
           <w:p>
-            <w:pPr>
-              <w:rPr>
-                <w:rFonts w:ascii="Aptos" w:hAnsi="Aptos"/>
-              </w:rPr>
-            </w:pPr>
             <w:r>
-              <w:rPr>
-                <w:rFonts w:ascii="Aptos" w:hAnsi="Aptos"/>
-              </w:rPr>
+              <w:t>Sustracción sin violencia (excluye dineros)</w:t>
+            </w:r>
+          </w:p>
+        </w:tc>
+        <w:tc>
+          <w:tcPr>
+            <w:tcW w:w="2484" w:type="dxa"/>
+          </w:tcPr>
+          <w:p>
+            <w:r/>
+          </w:p>
+        </w:tc>
+        <w:tc>
+          <w:tcPr>
+            <w:tcW w:w="2484" w:type="dxa"/>
+          </w:tcPr>
+          <w:p>
+            <w:r/>
+          </w:p>
+        </w:tc>
+        <w:tc>
+          <w:tcPr>
+            <w:tcW w:w="2484" w:type="dxa"/>
+          </w:tcPr>
+          <w:p>
+            <w:r/>
+          </w:p>
+        </w:tc>
+      </w:tr>
+      <w:tr>
+        <w:tc>
+          <w:tcPr>
+            <w:tcW w:w="2484" w:type="dxa"/>
+          </w:tcPr>
+          <w:p>
+            <w:r>
+              <w:t>Modulo de Equipos Electrónico y Eléctrico</w:t>
+            </w:r>
+          </w:p>
+        </w:tc>
+        <w:tc>
+          <w:tcPr>
+            <w:tcW w:w="2484" w:type="dxa"/>
+          </w:tcPr>
+          <w:p>
+            <w:r/>
+          </w:p>
+        </w:tc>
+        <w:tc>
+          <w:tcPr>
+            <w:tcW w:w="2484" w:type="dxa"/>
+          </w:tcPr>
+          <w:p>
+            <w:r/>
+          </w:p>
+        </w:tc>
+        <w:tc>
+          <w:tcPr>
+            <w:tcW w:w="2484" w:type="dxa"/>
+          </w:tcPr>
+          <w:p>
+            <w:r/>
+          </w:p>
+        </w:tc>
+      </w:tr>
+      <w:tr>
+        <w:tc>
+          <w:tcPr>
+            <w:tcW w:w="2484" w:type="dxa"/>
+          </w:tcPr>
+          <w:p>
+            <w:r>
+              <w:t>Rotura (daño interno)</w:t>
+            </w:r>
+          </w:p>
+        </w:tc>
+        <w:tc>
+          <w:tcPr>
+            <w:tcW w:w="2484" w:type="dxa"/>
+          </w:tcPr>
+          <w:p>
+            <w:r/>
+          </w:p>
+        </w:tc>
+        <w:tc>
+          <w:tcPr>
+            <w:tcW w:w="2484" w:type="dxa"/>
+          </w:tcPr>
+          <w:p>
+            <w:r/>
+          </w:p>
+        </w:tc>
+        <w:tc>
+          <w:tcPr>
+            <w:tcW w:w="2484" w:type="dxa"/>
+          </w:tcPr>
+          <w:p>
+            <w:r/>
+          </w:p>
+        </w:tc>
+      </w:tr>
+      <w:tr>
+        <w:tc>
+          <w:tcPr>
+            <w:tcW w:w="2484" w:type="dxa"/>
+          </w:tcPr>
+          <w:p>
+            <w:r>
+              <w:t>Sustracción con violencia</w:t>
+            </w:r>
+          </w:p>
+        </w:tc>
+        <w:tc>
+          <w:tcPr>
+            <w:tcW w:w="2484" w:type="dxa"/>
+          </w:tcPr>
+          <w:p>
+            <w:r/>
+          </w:p>
+        </w:tc>
+        <w:tc>
+          <w:tcPr>
+            <w:tcW w:w="2484" w:type="dxa"/>
+          </w:tcPr>
+          <w:p>
+            <w:r/>
+          </w:p>
+        </w:tc>
+        <w:tc>
+          <w:tcPr>
+            <w:tcW w:w="2484" w:type="dxa"/>
+          </w:tcPr>
+          <w:p>
+            <w:r/>
+          </w:p>
+        </w:tc>
+      </w:tr>
+      <w:tr>
+        <w:tc>
+          <w:tcPr>
+            <w:tcW w:w="2484" w:type="dxa"/>
+          </w:tcPr>
+          <w:p>
+            <w:r>
+              <w:t>Sustracción sin violencia (excluye dineros)</w:t>
+            </w:r>
+          </w:p>
+        </w:tc>
+        <w:tc>
+          <w:tcPr>
+            <w:tcW w:w="2484" w:type="dxa"/>
+          </w:tcPr>
+          <w:p>
+            <w:r/>
+          </w:p>
+        </w:tc>
+        <w:tc>
+          <w:tcPr>
+            <w:tcW w:w="2484" w:type="dxa"/>
+          </w:tcPr>
+          <w:p>
+            <w:r/>
+          </w:p>
+        </w:tc>
+        <w:tc>
+          <w:tcPr>
+            <w:tcW w:w="2484" w:type="dxa"/>
+          </w:tcPr>
+          <w:p>
+            <w:r/>
+          </w:p>
+        </w:tc>
+      </w:tr>
+      <w:tr>
+        <w:tc>
+          <w:tcPr>
+            <w:tcW w:w="2484" w:type="dxa"/>
+          </w:tcPr>
+          <w:p>
+            <w:r>
+              <w:t>Amparo equipos portátiles</w:t>
+            </w:r>
+          </w:p>
+        </w:tc>
+        <w:tc>
+          <w:tcPr>
+            <w:tcW w:w="2484" w:type="dxa"/>
+          </w:tcPr>
+          <w:p>
+            <w:r/>
+          </w:p>
+        </w:tc>
+        <w:tc>
+          <w:tcPr>
+            <w:tcW w:w="2484" w:type="dxa"/>
+          </w:tcPr>
+          <w:p>
+            <w:r/>
+          </w:p>
+        </w:tc>
+        <w:tc>
+          <w:tcPr>
+            <w:tcW w:w="2484" w:type="dxa"/>
+          </w:tcPr>
+          <w:p>
+            <w:r/>
+          </w:p>
+        </w:tc>
+      </w:tr>
+      <w:tr>
+        <w:tc>
+          <w:tcPr>
+            <w:tcW w:w="2484" w:type="dxa"/>
+          </w:tcPr>
+          <w:p>
+            <w:r>
+              <w:t>Modulo Manejo</w:t>
+            </w:r>
+          </w:p>
+        </w:tc>
+        <w:tc>
+          <w:tcPr>
+            <w:tcW w:w="2484" w:type="dxa"/>
+          </w:tcPr>
+          <w:p>
+            <w:r/>
+          </w:p>
+        </w:tc>
+        <w:tc>
+          <w:tcPr>
+            <w:tcW w:w="2484" w:type="dxa"/>
+          </w:tcPr>
+          <w:p>
+            <w:r/>
+          </w:p>
+        </w:tc>
+        <w:tc>
+          <w:tcPr>
+            <w:tcW w:w="2484" w:type="dxa"/>
+          </w:tcPr>
+          <w:p>
+            <w:r/>
+          </w:p>
+        </w:tc>
+      </w:tr>
+      <w:tr>
+        <w:tc>
+          <w:tcPr>
+            <w:tcW w:w="2484" w:type="dxa"/>
+          </w:tcPr>
+          <w:p>
+            <w:r>
+              <w:t>Manejo</w:t>
+            </w:r>
+          </w:p>
+        </w:tc>
+        <w:tc>
+          <w:tcPr>
+            <w:tcW w:w="2484" w:type="dxa"/>
+          </w:tcPr>
+          <w:p>
+            <w:r/>
+          </w:p>
+        </w:tc>
+        <w:tc>
+          <w:tcPr>
+            <w:tcW w:w="2484" w:type="dxa"/>
+          </w:tcPr>
+          <w:p>
+            <w:r/>
+          </w:p>
+        </w:tc>
+        <w:tc>
+          <w:tcPr>
+            <w:tcW w:w="2484" w:type="dxa"/>
+          </w:tcPr>
+          <w:p>
+            <w:r/>
+          </w:p>
+        </w:tc>
+      </w:tr>
+      <w:tr>
+        <w:tc>
+          <w:tcPr>
+            <w:tcW w:w="2484" w:type="dxa"/>
+          </w:tcPr>
+          <w:p>
+            <w:r>
+              <w:t>Modulo Muebles y Enseres</w:t>
+            </w:r>
+          </w:p>
+        </w:tc>
+        <w:tc>
+          <w:tcPr>
+            <w:tcW w:w="2484" w:type="dxa"/>
+          </w:tcPr>
+          <w:p>
+            <w:r/>
+          </w:p>
+        </w:tc>
+        <w:tc>
+          <w:tcPr>
+            <w:tcW w:w="2484" w:type="dxa"/>
+          </w:tcPr>
+          <w:p>
+            <w:r/>
+          </w:p>
+        </w:tc>
+        <w:tc>
+          <w:tcPr>
+            <w:tcW w:w="2484" w:type="dxa"/>
+          </w:tcPr>
+          <w:p>
+            <w:r/>
+          </w:p>
+        </w:tc>
+      </w:tr>
+      <w:tr>
+        <w:tc>
+          <w:tcPr>
+            <w:tcW w:w="2484" w:type="dxa"/>
+          </w:tcPr>
+          <w:p>
+            <w:r>
+              <w:t>Rotura (daño interno)</w:t>
+            </w:r>
+          </w:p>
+        </w:tc>
+        <w:tc>
+          <w:tcPr>
+            <w:tcW w:w="2484" w:type="dxa"/>
+          </w:tcPr>
+          <w:p>
+            <w:r/>
+          </w:p>
+        </w:tc>
+        <w:tc>
+          <w:tcPr>
+            <w:tcW w:w="2484" w:type="dxa"/>
+          </w:tcPr>
+          <w:p>
+            <w:r/>
+          </w:p>
+        </w:tc>
+        <w:tc>
+          <w:tcPr>
+            <w:tcW w:w="2484" w:type="dxa"/>
+          </w:tcPr>
+          <w:p>
+            <w:r/>
+          </w:p>
+        </w:tc>
+      </w:tr>
+      <w:tr>
+        <w:tc>
+          <w:tcPr>
+            <w:tcW w:w="2484" w:type="dxa"/>
+          </w:tcPr>
+          <w:p>
+            <w:r>
+              <w:t>Sustracción con violencia</w:t>
+            </w:r>
+          </w:p>
+        </w:tc>
+        <w:tc>
+          <w:tcPr>
+            <w:tcW w:w="2484" w:type="dxa"/>
+          </w:tcPr>
+          <w:p>
+            <w:r/>
+          </w:p>
+        </w:tc>
+        <w:tc>
+          <w:tcPr>
+            <w:tcW w:w="2484" w:type="dxa"/>
+          </w:tcPr>
+          <w:p>
+            <w:r/>
+          </w:p>
+        </w:tc>
+        <w:tc>
+          <w:tcPr>
+            <w:tcW w:w="2484" w:type="dxa"/>
+          </w:tcPr>
+          <w:p>
+            <w:r/>
+          </w:p>
+        </w:tc>
+      </w:tr>
+      <w:tr>
+        <w:tc>
+          <w:tcPr>
+            <w:tcW w:w="2484" w:type="dxa"/>
+          </w:tcPr>
+          <w:p>
+            <w:r>
+              <w:t>Sustracción sin violencia (excluye dineros)</w:t>
+            </w:r>
+          </w:p>
+        </w:tc>
+        <w:tc>
+          <w:tcPr>
+            <w:tcW w:w="2484" w:type="dxa"/>
+          </w:tcPr>
+          <w:p>
+            <w:r/>
+          </w:p>
+        </w:tc>
+        <w:tc>
+          <w:tcPr>
+            <w:tcW w:w="2484" w:type="dxa"/>
+          </w:tcPr>
+          <w:p>
+            <w:r/>
+          </w:p>
+        </w:tc>
+        <w:tc>
+          <w:tcPr>
+            <w:tcW w:w="2484" w:type="dxa"/>
+          </w:tcPr>
+          <w:p>
+            <w:r/>
+          </w:p>
+        </w:tc>
+      </w:tr>
+      <w:tr>
+        <w:tc>
+          <w:tcPr>
+            <w:tcW w:w="2484" w:type="dxa"/>
+          </w:tcPr>
+          <w:p>
+            <w:r>
+              <w:t>Modulo Directores Administradores</w:t>
+            </w:r>
+          </w:p>
+        </w:tc>
+        <w:tc>
+          <w:tcPr>
+            <w:tcW w:w="2484" w:type="dxa"/>
+          </w:tcPr>
+          <w:p>
+            <w:r/>
+          </w:p>
+        </w:tc>
+        <w:tc>
+          <w:tcPr>
+            <w:tcW w:w="2484" w:type="dxa"/>
+          </w:tcPr>
+          <w:p>
+            <w:r/>
+          </w:p>
+        </w:tc>
+        <w:tc>
+          <w:tcPr>
+            <w:tcW w:w="2484" w:type="dxa"/>
+          </w:tcPr>
+          <w:p>
+            <w:r/>
+          </w:p>
+        </w:tc>
+      </w:tr>
+      <w:tr>
+        <w:tc>
+          <w:tcPr>
+            <w:tcW w:w="2484" w:type="dxa"/>
+          </w:tcPr>
+          <w:p>
+            <w:r>
+              <w:t>Básico</w:t>
+            </w:r>
+          </w:p>
+        </w:tc>
+        <w:tc>
+          <w:tcPr>
+            <w:tcW w:w="2484" w:type="dxa"/>
+          </w:tcPr>
+          <w:p>
+            <w:r/>
+          </w:p>
+        </w:tc>
+        <w:tc>
+          <w:tcPr>
+            <w:tcW w:w="2484" w:type="dxa"/>
+          </w:tcPr>
+          <w:p>
+            <w:r/>
+          </w:p>
+        </w:tc>
+        <w:tc>
+          <w:tcPr>
+            <w:tcW w:w="2484" w:type="dxa"/>
+          </w:tcPr>
+          <w:p>
+            <w:r/>
+          </w:p>
+        </w:tc>
+      </w:tr>
+      <w:tr>
+        <w:tc>
+          <w:tcPr>
+            <w:tcW w:w="2484" w:type="dxa"/>
+          </w:tcPr>
+          <w:p>
+            <w:r>
+              <w:t>Sublímite Cobertura Copropiedad</w:t>
+            </w:r>
+          </w:p>
+        </w:tc>
+        <w:tc>
+          <w:tcPr>
+            <w:tcW w:w="2484" w:type="dxa"/>
+          </w:tcPr>
+          <w:p>
+            <w:r/>
+          </w:p>
+        </w:tc>
+        <w:tc>
+          <w:tcPr>
+            <w:tcW w:w="2484" w:type="dxa"/>
+          </w:tcPr>
+          <w:p>
+            <w:r/>
+          </w:p>
+        </w:tc>
+        <w:tc>
+          <w:tcPr>
+            <w:tcW w:w="2484" w:type="dxa"/>
+          </w:tcPr>
+          <w:p>
+            <w:r/>
+          </w:p>
+        </w:tc>
+      </w:tr>
+      <w:tr>
+        <w:tc>
+          <w:tcPr>
+            <w:tcW w:w="2484" w:type="dxa"/>
+          </w:tcPr>
+          <w:p>
+            <w:r>
               <w:t>Modulo RCE</w:t>
             </w:r>
           </w:p>
@@ -1649,35 +2067,23 @@
             <w:tcW w:w="2484" w:type="dxa"/>
           </w:tcPr>
           <w:p>
-            <w:pPr>
-              <w:rPr>
-                <w:rFonts w:ascii="Aptos" w:hAnsi="Aptos"/>
-              </w:rPr>
-            </w:pPr>
-          </w:p>
-        </w:tc>
-        <w:tc>
-          <w:tcPr>
-            <w:tcW w:w="2484" w:type="dxa"/>
-          </w:tcPr>
-          <w:p>
-            <w:pPr>
-              <w:rPr>
-                <w:rFonts w:ascii="Aptos" w:hAnsi="Aptos"/>
-              </w:rPr>
-            </w:pPr>
-          </w:p>
-        </w:tc>
-        <w:tc>
-          <w:tcPr>
-            <w:tcW w:w="2484" w:type="dxa"/>
-          </w:tcPr>
-          <w:p>
-            <w:pPr>
-              <w:rPr>
-                <w:rFonts w:ascii="Aptos" w:hAnsi="Aptos"/>
-              </w:rPr>
-            </w:pPr>
+            <w:r/>
+          </w:p>
+        </w:tc>
+        <w:tc>
+          <w:tcPr>
+            <w:tcW w:w="2484" w:type="dxa"/>
+          </w:tcPr>
+          <w:p>
+            <w:r/>
+          </w:p>
+        </w:tc>
+        <w:tc>
+          <w:tcPr>
+            <w:tcW w:w="2484" w:type="dxa"/>
+          </w:tcPr>
+          <w:p>
+            <w:r/>
           </w:p>
         </w:tc>
       </w:tr>
@@ -1687,15 +2093,7 @@
             <w:tcW w:w="2484" w:type="dxa"/>
           </w:tcPr>
           <w:p>
-            <w:pPr>
-              <w:rPr>
-                <w:rFonts w:ascii="Aptos" w:hAnsi="Aptos"/>
-              </w:rPr>
-            </w:pPr>
             <w:r>
-              <w:rPr>
-                <w:rFonts w:ascii="Aptos" w:hAnsi="Aptos"/>
-              </w:rPr>
               <w:t>Básico</w:t>
             </w:r>
           </w:p>
@@ -1705,35 +2103,239 @@
             <w:tcW w:w="2484" w:type="dxa"/>
           </w:tcPr>
           <w:p>
-            <w:pPr>
-              <w:rPr>
-                <w:rFonts w:ascii="Aptos" w:hAnsi="Aptos"/>
-              </w:rPr>
-            </w:pPr>
-          </w:p>
-        </w:tc>
-        <w:tc>
-          <w:tcPr>
-            <w:tcW w:w="2484" w:type="dxa"/>
-          </w:tcPr>
-          <w:p>
-            <w:pPr>
-              <w:rPr>
-                <w:rFonts w:ascii="Aptos" w:hAnsi="Aptos"/>
-              </w:rPr>
-            </w:pPr>
-          </w:p>
-        </w:tc>
-        <w:tc>
-          <w:tcPr>
-            <w:tcW w:w="2484" w:type="dxa"/>
-          </w:tcPr>
-          <w:p>
-            <w:pPr>
-              <w:rPr>
-                <w:rFonts w:ascii="Aptos" w:hAnsi="Aptos"/>
-              </w:rPr>
-            </w:pPr>
+            <w:r/>
+          </w:p>
+        </w:tc>
+        <w:tc>
+          <w:tcPr>
+            <w:tcW w:w="2484" w:type="dxa"/>
+          </w:tcPr>
+          <w:p>
+            <w:r/>
+          </w:p>
+        </w:tc>
+        <w:tc>
+          <w:tcPr>
+            <w:tcW w:w="2484" w:type="dxa"/>
+          </w:tcPr>
+          <w:p>
+            <w:r/>
+          </w:p>
+        </w:tc>
+      </w:tr>
+      <w:tr>
+        <w:tc>
+          <w:tcPr>
+            <w:tcW w:w="2484" w:type="dxa"/>
+          </w:tcPr>
+          <w:p>
+            <w:r>
+              <w:t>R.C. Patronal</w:t>
+            </w:r>
+          </w:p>
+        </w:tc>
+        <w:tc>
+          <w:tcPr>
+            <w:tcW w:w="2484" w:type="dxa"/>
+          </w:tcPr>
+          <w:p>
+            <w:r/>
+          </w:p>
+        </w:tc>
+        <w:tc>
+          <w:tcPr>
+            <w:tcW w:w="2484" w:type="dxa"/>
+          </w:tcPr>
+          <w:p>
+            <w:r/>
+          </w:p>
+        </w:tc>
+        <w:tc>
+          <w:tcPr>
+            <w:tcW w:w="2484" w:type="dxa"/>
+          </w:tcPr>
+          <w:p>
+            <w:r/>
+          </w:p>
+        </w:tc>
+      </w:tr>
+      <w:tr>
+        <w:tc>
+          <w:tcPr>
+            <w:tcW w:w="2484" w:type="dxa"/>
+          </w:tcPr>
+          <w:p>
+            <w:r>
+              <w:t>Contratistas Subcontratistas</w:t>
+            </w:r>
+          </w:p>
+        </w:tc>
+        <w:tc>
+          <w:tcPr>
+            <w:tcW w:w="2484" w:type="dxa"/>
+          </w:tcPr>
+          <w:p>
+            <w:r/>
+          </w:p>
+        </w:tc>
+        <w:tc>
+          <w:tcPr>
+            <w:tcW w:w="2484" w:type="dxa"/>
+          </w:tcPr>
+          <w:p>
+            <w:r/>
+          </w:p>
+        </w:tc>
+        <w:tc>
+          <w:tcPr>
+            <w:tcW w:w="2484" w:type="dxa"/>
+          </w:tcPr>
+          <w:p>
+            <w:r/>
+          </w:p>
+        </w:tc>
+      </w:tr>
+      <w:tr>
+        <w:tc>
+          <w:tcPr>
+            <w:tcW w:w="2484" w:type="dxa"/>
+          </w:tcPr>
+          <w:p>
+            <w:r>
+              <w:t>R.C. Cruzada entre copropietarios</w:t>
+            </w:r>
+          </w:p>
+        </w:tc>
+        <w:tc>
+          <w:tcPr>
+            <w:tcW w:w="2484" w:type="dxa"/>
+          </w:tcPr>
+          <w:p>
+            <w:r/>
+          </w:p>
+        </w:tc>
+        <w:tc>
+          <w:tcPr>
+            <w:tcW w:w="2484" w:type="dxa"/>
+          </w:tcPr>
+          <w:p>
+            <w:r/>
+          </w:p>
+        </w:tc>
+        <w:tc>
+          <w:tcPr>
+            <w:tcW w:w="2484" w:type="dxa"/>
+          </w:tcPr>
+          <w:p>
+            <w:r/>
+          </w:p>
+        </w:tc>
+      </w:tr>
+      <w:tr>
+        <w:tc>
+          <w:tcPr>
+            <w:tcW w:w="2484" w:type="dxa"/>
+          </w:tcPr>
+          <w:p>
+            <w:r>
+              <w:t>Gastos médicos</w:t>
+            </w:r>
+          </w:p>
+        </w:tc>
+        <w:tc>
+          <w:tcPr>
+            <w:tcW w:w="2484" w:type="dxa"/>
+          </w:tcPr>
+          <w:p>
+            <w:r/>
+          </w:p>
+        </w:tc>
+        <w:tc>
+          <w:tcPr>
+            <w:tcW w:w="2484" w:type="dxa"/>
+          </w:tcPr>
+          <w:p>
+            <w:r/>
+          </w:p>
+        </w:tc>
+        <w:tc>
+          <w:tcPr>
+            <w:tcW w:w="2484" w:type="dxa"/>
+          </w:tcPr>
+          <w:p>
+            <w:r/>
+          </w:p>
+        </w:tc>
+      </w:tr>
+      <w:tr>
+        <w:tc>
+          <w:tcPr>
+            <w:tcW w:w="2484" w:type="dxa"/>
+          </w:tcPr>
+          <w:p>
+            <w:r>
+              <w:t>Propietarios, arrendatarios y poseedores</w:t>
+            </w:r>
+          </w:p>
+        </w:tc>
+        <w:tc>
+          <w:tcPr>
+            <w:tcW w:w="2484" w:type="dxa"/>
+          </w:tcPr>
+          <w:p>
+            <w:r/>
+          </w:p>
+        </w:tc>
+        <w:tc>
+          <w:tcPr>
+            <w:tcW w:w="2484" w:type="dxa"/>
+          </w:tcPr>
+          <w:p>
+            <w:r/>
+          </w:p>
+        </w:tc>
+        <w:tc>
+          <w:tcPr>
+            <w:tcW w:w="2484" w:type="dxa"/>
+          </w:tcPr>
+          <w:p>
+            <w:r/>
+          </w:p>
+        </w:tc>
+      </w:tr>
+      <w:tr>
+        <w:tc>
+          <w:tcPr>
+            <w:tcW w:w="2484" w:type="dxa"/>
+          </w:tcPr>
+          <w:p>
+            <w:r>
+              <w:t>Parqueaderos</w:t>
+            </w:r>
+          </w:p>
+        </w:tc>
+        <w:tc>
+          <w:tcPr>
+            <w:tcW w:w="2484" w:type="dxa"/>
+          </w:tcPr>
+          <w:p>
+            <w:r/>
+          </w:p>
+        </w:tc>
+        <w:tc>
+          <w:tcPr>
+            <w:tcW w:w="2484" w:type="dxa"/>
+          </w:tcPr>
+          <w:p>
+            <w:r/>
+          </w:p>
+        </w:tc>
+        <w:tc>
+          <w:tcPr>
+            <w:tcW w:w="2484" w:type="dxa"/>
+          </w:tcPr>
+          <w:p>
+            <w:r/>
           </w:p>
         </w:tc>
       </w:tr>
@@ -1899,61 +2501,33 @@
             <w:tcW w:w="2484" w:type="dxa"/>
           </w:tcPr>
           <w:p>
-            <w:pPr>
-              <w:rPr>
-                <w:rFonts w:ascii="Aptos" w:hAnsi="Aptos"/>
-              </w:rPr>
-            </w:pPr>
             <w:r>
-              <w:rPr>
-                <w:rFonts w:ascii="Aptos" w:hAnsi="Aptos"/>
-              </w:rPr>
-              <w:t xml:space="preserve">Incendio y/o </w:t>
+              <w:t>Modulo básico de incendio</w:t>
             </w:r>
-            <w:proofErr w:type="spellStart"/>
-            <w:r>
-              <w:rPr>
-                <w:rFonts w:ascii="Aptos" w:hAnsi="Aptos"/>
-              </w:rPr>
-              <w:t>rayo</w:t>
-            </w:r>
-            <w:proofErr w:type="spellEnd"/>
-          </w:p>
-        </w:tc>
-        <w:tc>
-          <w:tcPr>
-            <w:tcW w:w="2484" w:type="dxa"/>
-          </w:tcPr>
-          <w:p>
-            <w:pPr>
-              <w:rPr>
-                <w:rFonts w:ascii="Aptos" w:hAnsi="Aptos"/>
-              </w:rPr>
-            </w:pPr>
-          </w:p>
-        </w:tc>
-        <w:tc>
-          <w:tcPr>
-            <w:tcW w:w="2484" w:type="dxa"/>
-          </w:tcPr>
-          <w:p>
-            <w:pPr>
-              <w:rPr>
-                <w:rFonts w:ascii="Aptos" w:hAnsi="Aptos"/>
-              </w:rPr>
-            </w:pPr>
-          </w:p>
-        </w:tc>
-        <w:tc>
-          <w:tcPr>
-            <w:tcW w:w="2484" w:type="dxa"/>
-          </w:tcPr>
-          <w:p>
-            <w:pPr>
-              <w:rPr>
-                <w:rFonts w:ascii="Aptos" w:hAnsi="Aptos"/>
-              </w:rPr>
-            </w:pPr>
+          </w:p>
+        </w:tc>
+        <w:tc>
+          <w:tcPr>
+            <w:tcW w:w="2484" w:type="dxa"/>
+          </w:tcPr>
+          <w:p>
+            <w:r/>
+          </w:p>
+        </w:tc>
+        <w:tc>
+          <w:tcPr>
+            <w:tcW w:w="2484" w:type="dxa"/>
+          </w:tcPr>
+          <w:p>
+            <w:r/>
+          </w:p>
+        </w:tc>
+        <w:tc>
+          <w:tcPr>
+            <w:tcW w:w="2484" w:type="dxa"/>
+          </w:tcPr>
+          <w:p>
+            <w:r/>
           </w:p>
         </w:tc>
       </w:tr>
@@ -1963,18 +2537,8 @@
             <w:tcW w:w="2484" w:type="dxa"/>
           </w:tcPr>
           <w:p>
-            <w:pPr>
-              <w:rPr>
-                <w:rFonts w:ascii="Aptos" w:hAnsi="Aptos"/>
-                <w:lang w:val="es-CO"/>
-              </w:rPr>
-            </w:pPr>
             <w:r>
-              <w:rPr>
-                <w:rFonts w:ascii="Aptos" w:hAnsi="Aptos"/>
-                <w:lang w:val="es-CO"/>
-              </w:rPr>
-              <w:t>Explosión, Daños por agua, Anegación</w:t>
+              <w:t>Incendio y/o rayo</w:t>
             </w:r>
           </w:p>
         </w:tc>
@@ -1983,38 +2547,23 @@
             <w:tcW w:w="2484" w:type="dxa"/>
           </w:tcPr>
           <w:p>
-            <w:pPr>
-              <w:rPr>
-                <w:rFonts w:ascii="Aptos" w:hAnsi="Aptos"/>
-                <w:lang w:val="es-CO"/>
-              </w:rPr>
-            </w:pPr>
-          </w:p>
-        </w:tc>
-        <w:tc>
-          <w:tcPr>
-            <w:tcW w:w="2484" w:type="dxa"/>
-          </w:tcPr>
-          <w:p>
-            <w:pPr>
-              <w:rPr>
-                <w:rFonts w:ascii="Aptos" w:hAnsi="Aptos"/>
-                <w:lang w:val="es-CO"/>
-              </w:rPr>
-            </w:pPr>
-          </w:p>
-        </w:tc>
-        <w:tc>
-          <w:tcPr>
-            <w:tcW w:w="2484" w:type="dxa"/>
-          </w:tcPr>
-          <w:p>
-            <w:pPr>
-              <w:rPr>
-                <w:rFonts w:ascii="Aptos" w:hAnsi="Aptos"/>
-                <w:lang w:val="es-CO"/>
-              </w:rPr>
-            </w:pPr>
+            <w:r/>
+          </w:p>
+        </w:tc>
+        <w:tc>
+          <w:tcPr>
+            <w:tcW w:w="2484" w:type="dxa"/>
+          </w:tcPr>
+          <w:p>
+            <w:r/>
+          </w:p>
+        </w:tc>
+        <w:tc>
+          <w:tcPr>
+            <w:tcW w:w="2484" w:type="dxa"/>
+          </w:tcPr>
+          <w:p>
+            <w:r/>
           </w:p>
         </w:tc>
       </w:tr>
@@ -2024,18 +2573,8 @@
             <w:tcW w:w="2484" w:type="dxa"/>
           </w:tcPr>
           <w:p>
-            <w:pPr>
-              <w:rPr>
-                <w:rFonts w:ascii="Aptos" w:hAnsi="Aptos"/>
-                <w:lang w:val="es-CO"/>
-              </w:rPr>
-            </w:pPr>
             <w:r>
-              <w:rPr>
-                <w:rFonts w:ascii="Aptos" w:hAnsi="Aptos"/>
-                <w:lang w:val="es-CO"/>
-              </w:rPr>
-              <w:t>Terremoto, temblor y/o erupción</w:t>
+              <w:t>Explosión, Daños por agua, Anegación, deslizamiento y avalancha, Extended coverage</w:t>
             </w:r>
           </w:p>
         </w:tc>
@@ -2044,38 +2583,23 @@
             <w:tcW w:w="2484" w:type="dxa"/>
           </w:tcPr>
           <w:p>
-            <w:pPr>
-              <w:rPr>
-                <w:rFonts w:ascii="Aptos" w:hAnsi="Aptos"/>
-                <w:lang w:val="es-CO"/>
-              </w:rPr>
-            </w:pPr>
-          </w:p>
-        </w:tc>
-        <w:tc>
-          <w:tcPr>
-            <w:tcW w:w="2484" w:type="dxa"/>
-          </w:tcPr>
-          <w:p>
-            <w:pPr>
-              <w:rPr>
-                <w:rFonts w:ascii="Aptos" w:hAnsi="Aptos"/>
-                <w:lang w:val="es-CO"/>
-              </w:rPr>
-            </w:pPr>
-          </w:p>
-        </w:tc>
-        <w:tc>
-          <w:tcPr>
-            <w:tcW w:w="2484" w:type="dxa"/>
-          </w:tcPr>
-          <w:p>
-            <w:pPr>
-              <w:rPr>
-                <w:rFonts w:ascii="Aptos" w:hAnsi="Aptos"/>
-                <w:lang w:val="es-CO"/>
-              </w:rPr>
-            </w:pPr>
+            <w:r/>
+          </w:p>
+        </w:tc>
+        <w:tc>
+          <w:tcPr>
+            <w:tcW w:w="2484" w:type="dxa"/>
+          </w:tcPr>
+          <w:p>
+            <w:r/>
+          </w:p>
+        </w:tc>
+        <w:tc>
+          <w:tcPr>
+            <w:tcW w:w="2484" w:type="dxa"/>
+          </w:tcPr>
+          <w:p>
+            <w:r/>
           </w:p>
         </w:tc>
       </w:tr>
@@ -2085,64 +2609,537 @@
             <w:tcW w:w="2484" w:type="dxa"/>
           </w:tcPr>
           <w:p>
-            <w:pPr>
-              <w:rPr>
-                <w:rFonts w:ascii="Aptos" w:hAnsi="Aptos"/>
-              </w:rPr>
-            </w:pPr>
             <w:r>
-              <w:rPr>
-                <w:rFonts w:ascii="Aptos" w:hAnsi="Aptos"/>
-              </w:rPr>
-              <w:t xml:space="preserve">RCE </w:t>
+              <w:t>HMACC, AMIT</w:t>
             </w:r>
-            <w:proofErr w:type="spellStart"/>
+          </w:p>
+        </w:tc>
+        <w:tc>
+          <w:tcPr>
+            <w:tcW w:w="2484" w:type="dxa"/>
+          </w:tcPr>
+          <w:p>
+            <w:r/>
+          </w:p>
+        </w:tc>
+        <w:tc>
+          <w:tcPr>
+            <w:tcW w:w="2484" w:type="dxa"/>
+          </w:tcPr>
+          <w:p>
+            <w:r/>
+          </w:p>
+        </w:tc>
+        <w:tc>
+          <w:tcPr>
+            <w:tcW w:w="2484" w:type="dxa"/>
+          </w:tcPr>
+          <w:p>
+            <w:r/>
+          </w:p>
+        </w:tc>
+      </w:tr>
+      <w:tr>
+        <w:tc>
+          <w:tcPr>
+            <w:tcW w:w="2484" w:type="dxa"/>
+          </w:tcPr>
+          <w:p>
             <w:r>
-              <w:rPr>
-                <w:rFonts w:ascii="Aptos" w:hAnsi="Aptos"/>
-              </w:rPr>
+              <w:t>Terremoto, temblor y/o erupción volcánica</w:t>
+            </w:r>
+          </w:p>
+        </w:tc>
+        <w:tc>
+          <w:tcPr>
+            <w:tcW w:w="2484" w:type="dxa"/>
+          </w:tcPr>
+          <w:p>
+            <w:r/>
+          </w:p>
+        </w:tc>
+        <w:tc>
+          <w:tcPr>
+            <w:tcW w:w="2484" w:type="dxa"/>
+          </w:tcPr>
+          <w:p>
+            <w:r/>
+          </w:p>
+        </w:tc>
+        <w:tc>
+          <w:tcPr>
+            <w:tcW w:w="2484" w:type="dxa"/>
+          </w:tcPr>
+          <w:p>
+            <w:r/>
+          </w:p>
+        </w:tc>
+      </w:tr>
+      <w:tr>
+        <w:tc>
+          <w:tcPr>
+            <w:tcW w:w="2484" w:type="dxa"/>
+          </w:tcPr>
+          <w:p>
+            <w:r>
+              <w:t>Modulo de Maquinaria y Equipo</w:t>
+            </w:r>
+          </w:p>
+        </w:tc>
+        <w:tc>
+          <w:tcPr>
+            <w:tcW w:w="2484" w:type="dxa"/>
+          </w:tcPr>
+          <w:p>
+            <w:r/>
+          </w:p>
+        </w:tc>
+        <w:tc>
+          <w:tcPr>
+            <w:tcW w:w="2484" w:type="dxa"/>
+          </w:tcPr>
+          <w:p>
+            <w:r/>
+          </w:p>
+        </w:tc>
+        <w:tc>
+          <w:tcPr>
+            <w:tcW w:w="2484" w:type="dxa"/>
+          </w:tcPr>
+          <w:p>
+            <w:r/>
+          </w:p>
+        </w:tc>
+      </w:tr>
+      <w:tr>
+        <w:tc>
+          <w:tcPr>
+            <w:tcW w:w="2484" w:type="dxa"/>
+          </w:tcPr>
+          <w:p>
+            <w:r>
+              <w:t>Rotura de maquinaria (daño interno)</w:t>
+            </w:r>
+          </w:p>
+        </w:tc>
+        <w:tc>
+          <w:tcPr>
+            <w:tcW w:w="2484" w:type="dxa"/>
+          </w:tcPr>
+          <w:p>
+            <w:r/>
+          </w:p>
+        </w:tc>
+        <w:tc>
+          <w:tcPr>
+            <w:tcW w:w="2484" w:type="dxa"/>
+          </w:tcPr>
+          <w:p>
+            <w:r/>
+          </w:p>
+        </w:tc>
+        <w:tc>
+          <w:tcPr>
+            <w:tcW w:w="2484" w:type="dxa"/>
+          </w:tcPr>
+          <w:p>
+            <w:r/>
+          </w:p>
+        </w:tc>
+      </w:tr>
+      <w:tr>
+        <w:tc>
+          <w:tcPr>
+            <w:tcW w:w="2484" w:type="dxa"/>
+          </w:tcPr>
+          <w:p>
+            <w:r>
+              <w:t>Sustracción con violencia</w:t>
+            </w:r>
+          </w:p>
+        </w:tc>
+        <w:tc>
+          <w:tcPr>
+            <w:tcW w:w="2484" w:type="dxa"/>
+          </w:tcPr>
+          <w:p>
+            <w:r/>
+          </w:p>
+        </w:tc>
+        <w:tc>
+          <w:tcPr>
+            <w:tcW w:w="2484" w:type="dxa"/>
+          </w:tcPr>
+          <w:p>
+            <w:r/>
+          </w:p>
+        </w:tc>
+        <w:tc>
+          <w:tcPr>
+            <w:tcW w:w="2484" w:type="dxa"/>
+          </w:tcPr>
+          <w:p>
+            <w:r/>
+          </w:p>
+        </w:tc>
+      </w:tr>
+      <w:tr>
+        <w:tc>
+          <w:tcPr>
+            <w:tcW w:w="2484" w:type="dxa"/>
+          </w:tcPr>
+          <w:p>
+            <w:r>
+              <w:t>Sustracción sin violencia (excluye dineros)</w:t>
+            </w:r>
+          </w:p>
+        </w:tc>
+        <w:tc>
+          <w:tcPr>
+            <w:tcW w:w="2484" w:type="dxa"/>
+          </w:tcPr>
+          <w:p>
+            <w:r/>
+          </w:p>
+        </w:tc>
+        <w:tc>
+          <w:tcPr>
+            <w:tcW w:w="2484" w:type="dxa"/>
+          </w:tcPr>
+          <w:p>
+            <w:r/>
+          </w:p>
+        </w:tc>
+        <w:tc>
+          <w:tcPr>
+            <w:tcW w:w="2484" w:type="dxa"/>
+          </w:tcPr>
+          <w:p>
+            <w:r/>
+          </w:p>
+        </w:tc>
+      </w:tr>
+      <w:tr>
+        <w:tc>
+          <w:tcPr>
+            <w:tcW w:w="2484" w:type="dxa"/>
+          </w:tcPr>
+          <w:p>
+            <w:r>
+              <w:t>Modulo de Equipos Electrónico y Eléctrico / Muebles y Enseres</w:t>
+            </w:r>
+          </w:p>
+        </w:tc>
+        <w:tc>
+          <w:tcPr>
+            <w:tcW w:w="2484" w:type="dxa"/>
+          </w:tcPr>
+          <w:p>
+            <w:r/>
+          </w:p>
+        </w:tc>
+        <w:tc>
+          <w:tcPr>
+            <w:tcW w:w="2484" w:type="dxa"/>
+          </w:tcPr>
+          <w:p>
+            <w:r/>
+          </w:p>
+        </w:tc>
+        <w:tc>
+          <w:tcPr>
+            <w:tcW w:w="2484" w:type="dxa"/>
+          </w:tcPr>
+          <w:p>
+            <w:r/>
+          </w:p>
+        </w:tc>
+      </w:tr>
+      <w:tr>
+        <w:tc>
+          <w:tcPr>
+            <w:tcW w:w="2484" w:type="dxa"/>
+          </w:tcPr>
+          <w:p>
+            <w:r>
+              <w:t>Rotura (daño interno)</w:t>
+            </w:r>
+          </w:p>
+        </w:tc>
+        <w:tc>
+          <w:tcPr>
+            <w:tcW w:w="2484" w:type="dxa"/>
+          </w:tcPr>
+          <w:p>
+            <w:r/>
+          </w:p>
+        </w:tc>
+        <w:tc>
+          <w:tcPr>
+            <w:tcW w:w="2484" w:type="dxa"/>
+          </w:tcPr>
+          <w:p>
+            <w:r/>
+          </w:p>
+        </w:tc>
+        <w:tc>
+          <w:tcPr>
+            <w:tcW w:w="2484" w:type="dxa"/>
+          </w:tcPr>
+          <w:p>
+            <w:r/>
+          </w:p>
+        </w:tc>
+      </w:tr>
+      <w:tr>
+        <w:tc>
+          <w:tcPr>
+            <w:tcW w:w="2484" w:type="dxa"/>
+          </w:tcPr>
+          <w:p>
+            <w:r>
+              <w:t>Sustracción con violencia</w:t>
+            </w:r>
+          </w:p>
+        </w:tc>
+        <w:tc>
+          <w:tcPr>
+            <w:tcW w:w="2484" w:type="dxa"/>
+          </w:tcPr>
+          <w:p>
+            <w:r/>
+          </w:p>
+        </w:tc>
+        <w:tc>
+          <w:tcPr>
+            <w:tcW w:w="2484" w:type="dxa"/>
+          </w:tcPr>
+          <w:p>
+            <w:r/>
+          </w:p>
+        </w:tc>
+        <w:tc>
+          <w:tcPr>
+            <w:tcW w:w="2484" w:type="dxa"/>
+          </w:tcPr>
+          <w:p>
+            <w:r/>
+          </w:p>
+        </w:tc>
+      </w:tr>
+      <w:tr>
+        <w:tc>
+          <w:tcPr>
+            <w:tcW w:w="2484" w:type="dxa"/>
+          </w:tcPr>
+          <w:p>
+            <w:r>
+              <w:t>Sustracción sin violencia (excluye dineros)</w:t>
+            </w:r>
+          </w:p>
+        </w:tc>
+        <w:tc>
+          <w:tcPr>
+            <w:tcW w:w="2484" w:type="dxa"/>
+          </w:tcPr>
+          <w:p>
+            <w:r/>
+          </w:p>
+        </w:tc>
+        <w:tc>
+          <w:tcPr>
+            <w:tcW w:w="2484" w:type="dxa"/>
+          </w:tcPr>
+          <w:p>
+            <w:r/>
+          </w:p>
+        </w:tc>
+        <w:tc>
+          <w:tcPr>
+            <w:tcW w:w="2484" w:type="dxa"/>
+          </w:tcPr>
+          <w:p>
+            <w:r/>
+          </w:p>
+        </w:tc>
+      </w:tr>
+      <w:tr>
+        <w:tc>
+          <w:tcPr>
+            <w:tcW w:w="2484" w:type="dxa"/>
+          </w:tcPr>
+          <w:p>
+            <w:r>
+              <w:t>Modulo Directores Administradores</w:t>
+            </w:r>
+          </w:p>
+        </w:tc>
+        <w:tc>
+          <w:tcPr>
+            <w:tcW w:w="2484" w:type="dxa"/>
+          </w:tcPr>
+          <w:p>
+            <w:r/>
+          </w:p>
+        </w:tc>
+        <w:tc>
+          <w:tcPr>
+            <w:tcW w:w="2484" w:type="dxa"/>
+          </w:tcPr>
+          <w:p>
+            <w:r/>
+          </w:p>
+        </w:tc>
+        <w:tc>
+          <w:tcPr>
+            <w:tcW w:w="2484" w:type="dxa"/>
+          </w:tcPr>
+          <w:p>
+            <w:r/>
+          </w:p>
+        </w:tc>
+      </w:tr>
+      <w:tr>
+        <w:tc>
+          <w:tcPr>
+            <w:tcW w:w="2484" w:type="dxa"/>
+          </w:tcPr>
+          <w:p>
+            <w:r>
               <w:t>Básico</w:t>
             </w:r>
-            <w:proofErr w:type="spellEnd"/>
-          </w:p>
-        </w:tc>
-        <w:tc>
-          <w:tcPr>
-            <w:tcW w:w="2484" w:type="dxa"/>
-          </w:tcPr>
-          <w:p>
-            <w:pPr>
-              <w:rPr>
-                <w:rFonts w:ascii="Aptos" w:hAnsi="Aptos"/>
-                <w:lang w:val="es-CO"/>
-              </w:rPr>
-            </w:pPr>
-          </w:p>
-        </w:tc>
-        <w:tc>
-          <w:tcPr>
-            <w:tcW w:w="2484" w:type="dxa"/>
-          </w:tcPr>
-          <w:p>
-            <w:pPr>
-              <w:rPr>
-                <w:rFonts w:ascii="Aptos" w:hAnsi="Aptos"/>
-                <w:lang w:val="es-CO"/>
-              </w:rPr>
-            </w:pPr>
-          </w:p>
-        </w:tc>
-        <w:tc>
-          <w:tcPr>
-            <w:tcW w:w="2484" w:type="dxa"/>
-          </w:tcPr>
-          <w:p>
-            <w:pPr>
-              <w:rPr>
-                <w:rFonts w:ascii="Aptos" w:hAnsi="Aptos"/>
-                <w:lang w:val="es-CO"/>
-              </w:rPr>
-            </w:pPr>
+          </w:p>
+        </w:tc>
+        <w:tc>
+          <w:tcPr>
+            <w:tcW w:w="2484" w:type="dxa"/>
+          </w:tcPr>
+          <w:p>
+            <w:r/>
+          </w:p>
+        </w:tc>
+        <w:tc>
+          <w:tcPr>
+            <w:tcW w:w="2484" w:type="dxa"/>
+          </w:tcPr>
+          <w:p>
+            <w:r/>
+          </w:p>
+        </w:tc>
+        <w:tc>
+          <w:tcPr>
+            <w:tcW w:w="2484" w:type="dxa"/>
+          </w:tcPr>
+          <w:p>
+            <w:r/>
+          </w:p>
+        </w:tc>
+      </w:tr>
+      <w:tr>
+        <w:tc>
+          <w:tcPr>
+            <w:tcW w:w="2484" w:type="dxa"/>
+          </w:tcPr>
+          <w:p>
+            <w:r>
+              <w:t>Sublímite Cobertura Copropiedad</w:t>
+            </w:r>
+          </w:p>
+        </w:tc>
+        <w:tc>
+          <w:tcPr>
+            <w:tcW w:w="2484" w:type="dxa"/>
+          </w:tcPr>
+          <w:p>
+            <w:r/>
+          </w:p>
+        </w:tc>
+        <w:tc>
+          <w:tcPr>
+            <w:tcW w:w="2484" w:type="dxa"/>
+          </w:tcPr>
+          <w:p>
+            <w:r/>
+          </w:p>
+        </w:tc>
+        <w:tc>
+          <w:tcPr>
+            <w:tcW w:w="2484" w:type="dxa"/>
+          </w:tcPr>
+          <w:p>
+            <w:r/>
+          </w:p>
+        </w:tc>
+      </w:tr>
+      <w:tr>
+        <w:tc>
+          <w:tcPr>
+            <w:tcW w:w="2484" w:type="dxa"/>
+          </w:tcPr>
+          <w:p>
+            <w:r>
+              <w:t>Modulo RCE</w:t>
+            </w:r>
+          </w:p>
+        </w:tc>
+        <w:tc>
+          <w:tcPr>
+            <w:tcW w:w="2484" w:type="dxa"/>
+          </w:tcPr>
+          <w:p>
+            <w:r/>
+          </w:p>
+        </w:tc>
+        <w:tc>
+          <w:tcPr>
+            <w:tcW w:w="2484" w:type="dxa"/>
+          </w:tcPr>
+          <w:p>
+            <w:r/>
+          </w:p>
+        </w:tc>
+        <w:tc>
+          <w:tcPr>
+            <w:tcW w:w="2484" w:type="dxa"/>
+          </w:tcPr>
+          <w:p>
+            <w:r/>
+          </w:p>
+        </w:tc>
+      </w:tr>
+      <w:tr>
+        <w:tc>
+          <w:tcPr>
+            <w:tcW w:w="2484" w:type="dxa"/>
+          </w:tcPr>
+          <w:p>
+            <w:r>
+              <w:t>Básico</w:t>
+            </w:r>
+          </w:p>
+        </w:tc>
+        <w:tc>
+          <w:tcPr>
+            <w:tcW w:w="2484" w:type="dxa"/>
+          </w:tcPr>
+          <w:p>
+            <w:r/>
+          </w:p>
+        </w:tc>
+        <w:tc>
+          <w:tcPr>
+            <w:tcW w:w="2484" w:type="dxa"/>
+          </w:tcPr>
+          <w:p>
+            <w:r/>
+          </w:p>
+        </w:tc>
+        <w:tc>
+          <w:tcPr>
+            <w:tcW w:w="2484" w:type="dxa"/>
+          </w:tcPr>
+          <w:p>
+            <w:r/>
           </w:p>
         </w:tc>
       </w:tr>
@@ -2173,21 +3170,815 @@
         <w:t>VII. ASISTENCIAS</w:t>
       </w:r>
     </w:p>
-    <w:p>
-      <w:pPr>
-        <w:rPr>
-          <w:rFonts w:ascii="Aptos" w:hAnsi="Aptos"/>
-          <w:lang w:val="es-CO"/>
-        </w:rPr>
-      </w:pPr>
-      <w:r>
-        <w:rPr>
-          <w:rFonts w:ascii="Aptos" w:hAnsi="Aptos"/>
-          <w:lang w:val="es-CO"/>
-        </w:rPr>
-        <w:t>Ver tabla detallada de asistencias en el documento original. Las coberturas principales incluyen cerrajería, plomería, electricidad y asistencia jurídica para áreas comunes.</w:t>
-      </w:r>
-    </w:p>
+    <w:tbl>
+      <w:tblPr>
+        <w:tblStyle w:val="TableGrid"/>
+        <w:tblW w:w="0" w:type="auto"/>
+        <w:tblLook w:val="04A0" w:firstRow="1" w:lastRow="0" w:firstColumn="1" w:lastColumn="0" w:noHBand="0" w:noVBand="1"/>
+      </w:tblPr>
+      <w:tblGrid>
+        <w:gridCol w:w="2483"/>
+        <w:gridCol w:w="2481"/>
+        <w:gridCol w:w="2481"/>
+        <w:gridCol w:w="2481"/>
+      </w:tblGrid>
+      <w:tr>
+        <w:tc>
+          <w:tcPr>
+            <w:tcW w:w="2484" w:type="dxa"/>
+            <w:shd w:val="clear" w:color="auto" w:fill="002060"/>
+          </w:tcPr>
+          <w:p>
+            <w:r>
+              <w:t>Servicio de Asistencia</w:t>
+            </w:r>
+          </w:p>
+        </w:tc>
+        <w:tc>
+          <w:tcPr>
+            <w:tcW w:w="2484" w:type="dxa"/>
+            <w:shd w:val="clear" w:color="auto" w:fill="002060"/>
+          </w:tcPr>
+          <w:p>
+            <w:r/>
+          </w:p>
+        </w:tc>
+        <w:tc>
+          <w:tcPr>
+            <w:tcW w:w="2484" w:type="dxa"/>
+            <w:shd w:val="clear" w:color="auto" w:fill="002060"/>
+          </w:tcPr>
+          <w:p>
+            <w:r/>
+          </w:p>
+        </w:tc>
+        <w:tc>
+          <w:tcPr>
+            <w:tcW w:w="2484" w:type="dxa"/>
+            <w:shd w:val="clear" w:color="auto" w:fill="002060"/>
+          </w:tcPr>
+          <w:p>
+            <w:r/>
+          </w:p>
+        </w:tc>
+      </w:tr>
+      <w:tr>
+        <w:tc>
+          <w:tcPr>
+            <w:tcW w:w="2484" w:type="dxa"/>
+          </w:tcPr>
+          <w:p>
+            <w:r>
+              <w:t>ASISTENCIA ÁREA COMUNES</w:t>
+            </w:r>
+          </w:p>
+        </w:tc>
+        <w:tc>
+          <w:tcPr>
+            <w:tcW w:w="2484" w:type="dxa"/>
+          </w:tcPr>
+          <w:p>
+            <w:r/>
+          </w:p>
+        </w:tc>
+        <w:tc>
+          <w:tcPr>
+            <w:tcW w:w="2484" w:type="dxa"/>
+          </w:tcPr>
+          <w:p>
+            <w:r/>
+          </w:p>
+        </w:tc>
+        <w:tc>
+          <w:tcPr>
+            <w:tcW w:w="2484" w:type="dxa"/>
+          </w:tcPr>
+          <w:p>
+            <w:r/>
+          </w:p>
+        </w:tc>
+      </w:tr>
+      <w:tr>
+        <w:tc>
+          <w:tcPr>
+            <w:tcW w:w="2484" w:type="dxa"/>
+          </w:tcPr>
+          <w:p>
+            <w:r>
+              <w:t>Envío y pago de cerrajero por emergencia</w:t>
+            </w:r>
+          </w:p>
+        </w:tc>
+        <w:tc>
+          <w:tcPr>
+            <w:tcW w:w="2484" w:type="dxa"/>
+          </w:tcPr>
+          <w:p>
+            <w:r/>
+          </w:p>
+        </w:tc>
+        <w:tc>
+          <w:tcPr>
+            <w:tcW w:w="2484" w:type="dxa"/>
+          </w:tcPr>
+          <w:p>
+            <w:r/>
+          </w:p>
+        </w:tc>
+        <w:tc>
+          <w:tcPr>
+            <w:tcW w:w="2484" w:type="dxa"/>
+          </w:tcPr>
+          <w:p>
+            <w:r/>
+          </w:p>
+        </w:tc>
+      </w:tr>
+      <w:tr>
+        <w:tc>
+          <w:tcPr>
+            <w:tcW w:w="2484" w:type="dxa"/>
+          </w:tcPr>
+          <w:p>
+            <w:r>
+              <w:t>Envío y pago de vidriero por emergencia</w:t>
+            </w:r>
+          </w:p>
+        </w:tc>
+        <w:tc>
+          <w:tcPr>
+            <w:tcW w:w="2484" w:type="dxa"/>
+          </w:tcPr>
+          <w:p>
+            <w:r/>
+          </w:p>
+        </w:tc>
+        <w:tc>
+          <w:tcPr>
+            <w:tcW w:w="2484" w:type="dxa"/>
+          </w:tcPr>
+          <w:p>
+            <w:r/>
+          </w:p>
+        </w:tc>
+        <w:tc>
+          <w:tcPr>
+            <w:tcW w:w="2484" w:type="dxa"/>
+          </w:tcPr>
+          <w:p>
+            <w:r/>
+          </w:p>
+        </w:tc>
+      </w:tr>
+      <w:tr>
+        <w:tc>
+          <w:tcPr>
+            <w:tcW w:w="2484" w:type="dxa"/>
+          </w:tcPr>
+          <w:p>
+            <w:r>
+              <w:t>Envío y pago de electricista por emergencia</w:t>
+            </w:r>
+          </w:p>
+        </w:tc>
+        <w:tc>
+          <w:tcPr>
+            <w:tcW w:w="2484" w:type="dxa"/>
+          </w:tcPr>
+          <w:p>
+            <w:r/>
+          </w:p>
+        </w:tc>
+        <w:tc>
+          <w:tcPr>
+            <w:tcW w:w="2484" w:type="dxa"/>
+          </w:tcPr>
+          <w:p>
+            <w:r/>
+          </w:p>
+        </w:tc>
+        <w:tc>
+          <w:tcPr>
+            <w:tcW w:w="2484" w:type="dxa"/>
+          </w:tcPr>
+          <w:p>
+            <w:r/>
+          </w:p>
+        </w:tc>
+      </w:tr>
+      <w:tr>
+        <w:tc>
+          <w:tcPr>
+            <w:tcW w:w="2484" w:type="dxa"/>
+          </w:tcPr>
+          <w:p>
+            <w:r>
+              <w:t>Envío y pago de plomero por emergencia</w:t>
+            </w:r>
+          </w:p>
+        </w:tc>
+        <w:tc>
+          <w:tcPr>
+            <w:tcW w:w="2484" w:type="dxa"/>
+          </w:tcPr>
+          <w:p>
+            <w:r/>
+          </w:p>
+        </w:tc>
+        <w:tc>
+          <w:tcPr>
+            <w:tcW w:w="2484" w:type="dxa"/>
+          </w:tcPr>
+          <w:p>
+            <w:r/>
+          </w:p>
+        </w:tc>
+        <w:tc>
+          <w:tcPr>
+            <w:tcW w:w="2484" w:type="dxa"/>
+          </w:tcPr>
+          <w:p>
+            <w:r/>
+          </w:p>
+        </w:tc>
+      </w:tr>
+      <w:tr>
+        <w:tc>
+          <w:tcPr>
+            <w:tcW w:w="2484" w:type="dxa"/>
+          </w:tcPr>
+          <w:p>
+            <w:r>
+              <w:t>Gastos de traslado de bienes</w:t>
+            </w:r>
+          </w:p>
+        </w:tc>
+        <w:tc>
+          <w:tcPr>
+            <w:tcW w:w="2484" w:type="dxa"/>
+          </w:tcPr>
+          <w:p>
+            <w:r/>
+          </w:p>
+        </w:tc>
+        <w:tc>
+          <w:tcPr>
+            <w:tcW w:w="2484" w:type="dxa"/>
+          </w:tcPr>
+          <w:p>
+            <w:r/>
+          </w:p>
+        </w:tc>
+        <w:tc>
+          <w:tcPr>
+            <w:tcW w:w="2484" w:type="dxa"/>
+          </w:tcPr>
+          <w:p>
+            <w:r/>
+          </w:p>
+        </w:tc>
+      </w:tr>
+      <w:tr>
+        <w:tc>
+          <w:tcPr>
+            <w:tcW w:w="2484" w:type="dxa"/>
+          </w:tcPr>
+          <w:p>
+            <w:r>
+              <w:t>Gastos de celador sustituto</w:t>
+            </w:r>
+          </w:p>
+        </w:tc>
+        <w:tc>
+          <w:tcPr>
+            <w:tcW w:w="2484" w:type="dxa"/>
+          </w:tcPr>
+          <w:p>
+            <w:r/>
+          </w:p>
+        </w:tc>
+        <w:tc>
+          <w:tcPr>
+            <w:tcW w:w="2484" w:type="dxa"/>
+          </w:tcPr>
+          <w:p>
+            <w:r/>
+          </w:p>
+        </w:tc>
+        <w:tc>
+          <w:tcPr>
+            <w:tcW w:w="2484" w:type="dxa"/>
+          </w:tcPr>
+          <w:p>
+            <w:r/>
+          </w:p>
+        </w:tc>
+      </w:tr>
+      <w:tr>
+        <w:tc>
+          <w:tcPr>
+            <w:tcW w:w="2484" w:type="dxa"/>
+          </w:tcPr>
+          <w:p>
+            <w:r>
+              <w:t>Gastos de jardinería</w:t>
+            </w:r>
+          </w:p>
+        </w:tc>
+        <w:tc>
+          <w:tcPr>
+            <w:tcW w:w="2484" w:type="dxa"/>
+          </w:tcPr>
+          <w:p>
+            <w:r/>
+          </w:p>
+        </w:tc>
+        <w:tc>
+          <w:tcPr>
+            <w:tcW w:w="2484" w:type="dxa"/>
+          </w:tcPr>
+          <w:p>
+            <w:r/>
+          </w:p>
+        </w:tc>
+        <w:tc>
+          <w:tcPr>
+            <w:tcW w:w="2484" w:type="dxa"/>
+          </w:tcPr>
+          <w:p>
+            <w:r/>
+          </w:p>
+        </w:tc>
+      </w:tr>
+      <w:tr>
+        <w:tc>
+          <w:tcPr>
+            <w:tcW w:w="2484" w:type="dxa"/>
+          </w:tcPr>
+          <w:p>
+            <w:r>
+              <w:t>Auxiliar de servicios generales</w:t>
+            </w:r>
+          </w:p>
+        </w:tc>
+        <w:tc>
+          <w:tcPr>
+            <w:tcW w:w="2484" w:type="dxa"/>
+          </w:tcPr>
+          <w:p>
+            <w:r/>
+          </w:p>
+        </w:tc>
+        <w:tc>
+          <w:tcPr>
+            <w:tcW w:w="2484" w:type="dxa"/>
+          </w:tcPr>
+          <w:p>
+            <w:r/>
+          </w:p>
+        </w:tc>
+        <w:tc>
+          <w:tcPr>
+            <w:tcW w:w="2484" w:type="dxa"/>
+          </w:tcPr>
+          <w:p>
+            <w:r/>
+          </w:p>
+        </w:tc>
+      </w:tr>
+      <w:tr>
+        <w:tc>
+          <w:tcPr>
+            <w:tcW w:w="2484" w:type="dxa"/>
+          </w:tcPr>
+          <w:p>
+            <w:r>
+              <w:t>ASISTENCIA JURÍDICA</w:t>
+            </w:r>
+          </w:p>
+        </w:tc>
+        <w:tc>
+          <w:tcPr>
+            <w:tcW w:w="2484" w:type="dxa"/>
+          </w:tcPr>
+          <w:p>
+            <w:r/>
+          </w:p>
+        </w:tc>
+        <w:tc>
+          <w:tcPr>
+            <w:tcW w:w="2484" w:type="dxa"/>
+          </w:tcPr>
+          <w:p>
+            <w:r/>
+          </w:p>
+        </w:tc>
+        <w:tc>
+          <w:tcPr>
+            <w:tcW w:w="2484" w:type="dxa"/>
+          </w:tcPr>
+          <w:p>
+            <w:r/>
+          </w:p>
+        </w:tc>
+      </w:tr>
+      <w:tr>
+        <w:tc>
+          <w:tcPr>
+            <w:tcW w:w="2484" w:type="dxa"/>
+          </w:tcPr>
+          <w:p>
+            <w:r>
+              <w:t>Orientación jurídica</w:t>
+            </w:r>
+          </w:p>
+        </w:tc>
+        <w:tc>
+          <w:tcPr>
+            <w:tcW w:w="2484" w:type="dxa"/>
+          </w:tcPr>
+          <w:p>
+            <w:r/>
+          </w:p>
+        </w:tc>
+        <w:tc>
+          <w:tcPr>
+            <w:tcW w:w="2484" w:type="dxa"/>
+          </w:tcPr>
+          <w:p>
+            <w:r/>
+          </w:p>
+        </w:tc>
+        <w:tc>
+          <w:tcPr>
+            <w:tcW w:w="2484" w:type="dxa"/>
+          </w:tcPr>
+          <w:p>
+            <w:r/>
+          </w:p>
+        </w:tc>
+      </w:tr>
+      <w:tr>
+        <w:tc>
+          <w:tcPr>
+            <w:tcW w:w="2484" w:type="dxa"/>
+          </w:tcPr>
+          <w:p>
+            <w:r>
+              <w:t>Emisión de Conceptos</w:t>
+            </w:r>
+          </w:p>
+        </w:tc>
+        <w:tc>
+          <w:tcPr>
+            <w:tcW w:w="2484" w:type="dxa"/>
+          </w:tcPr>
+          <w:p>
+            <w:r/>
+          </w:p>
+        </w:tc>
+        <w:tc>
+          <w:tcPr>
+            <w:tcW w:w="2484" w:type="dxa"/>
+          </w:tcPr>
+          <w:p>
+            <w:r/>
+          </w:p>
+        </w:tc>
+        <w:tc>
+          <w:tcPr>
+            <w:tcW w:w="2484" w:type="dxa"/>
+          </w:tcPr>
+          <w:p>
+            <w:r/>
+          </w:p>
+        </w:tc>
+      </w:tr>
+      <w:tr>
+        <w:tc>
+          <w:tcPr>
+            <w:tcW w:w="2484" w:type="dxa"/>
+          </w:tcPr>
+          <w:p>
+            <w:r>
+              <w:t>Elaboración de documentos</w:t>
+            </w:r>
+          </w:p>
+        </w:tc>
+        <w:tc>
+          <w:tcPr>
+            <w:tcW w:w="2484" w:type="dxa"/>
+          </w:tcPr>
+          <w:p>
+            <w:r/>
+          </w:p>
+        </w:tc>
+        <w:tc>
+          <w:tcPr>
+            <w:tcW w:w="2484" w:type="dxa"/>
+          </w:tcPr>
+          <w:p>
+            <w:r/>
+          </w:p>
+        </w:tc>
+        <w:tc>
+          <w:tcPr>
+            <w:tcW w:w="2484" w:type="dxa"/>
+          </w:tcPr>
+          <w:p>
+            <w:r/>
+          </w:p>
+        </w:tc>
+      </w:tr>
+      <w:tr>
+        <w:tc>
+          <w:tcPr>
+            <w:tcW w:w="2484" w:type="dxa"/>
+          </w:tcPr>
+          <w:p>
+            <w:r>
+              <w:t>ASISTENCIA ÁREAS PRIVADAS</w:t>
+            </w:r>
+          </w:p>
+        </w:tc>
+        <w:tc>
+          <w:tcPr>
+            <w:tcW w:w="2484" w:type="dxa"/>
+          </w:tcPr>
+          <w:p>
+            <w:r/>
+          </w:p>
+        </w:tc>
+        <w:tc>
+          <w:tcPr>
+            <w:tcW w:w="2484" w:type="dxa"/>
+          </w:tcPr>
+          <w:p>
+            <w:r/>
+          </w:p>
+        </w:tc>
+        <w:tc>
+          <w:tcPr>
+            <w:tcW w:w="2484" w:type="dxa"/>
+          </w:tcPr>
+          <w:p>
+            <w:r/>
+          </w:p>
+        </w:tc>
+      </w:tr>
+      <w:tr>
+        <w:tc>
+          <w:tcPr>
+            <w:tcW w:w="2484" w:type="dxa"/>
+          </w:tcPr>
+          <w:p>
+            <w:r>
+              <w:t>Envío y pago de cerrajero por emergencia</w:t>
+            </w:r>
+          </w:p>
+        </w:tc>
+        <w:tc>
+          <w:tcPr>
+            <w:tcW w:w="2484" w:type="dxa"/>
+          </w:tcPr>
+          <w:p>
+            <w:r/>
+          </w:p>
+        </w:tc>
+        <w:tc>
+          <w:tcPr>
+            <w:tcW w:w="2484" w:type="dxa"/>
+          </w:tcPr>
+          <w:p>
+            <w:r/>
+          </w:p>
+        </w:tc>
+        <w:tc>
+          <w:tcPr>
+            <w:tcW w:w="2484" w:type="dxa"/>
+          </w:tcPr>
+          <w:p>
+            <w:r/>
+          </w:p>
+        </w:tc>
+      </w:tr>
+      <w:tr>
+        <w:tc>
+          <w:tcPr>
+            <w:tcW w:w="2484" w:type="dxa"/>
+          </w:tcPr>
+          <w:p>
+            <w:r>
+              <w:t>Envío y pago de plomero por emergencia</w:t>
+            </w:r>
+          </w:p>
+        </w:tc>
+        <w:tc>
+          <w:tcPr>
+            <w:tcW w:w="2484" w:type="dxa"/>
+          </w:tcPr>
+          <w:p>
+            <w:r/>
+          </w:p>
+        </w:tc>
+        <w:tc>
+          <w:tcPr>
+            <w:tcW w:w="2484" w:type="dxa"/>
+          </w:tcPr>
+          <w:p>
+            <w:r/>
+          </w:p>
+        </w:tc>
+        <w:tc>
+          <w:tcPr>
+            <w:tcW w:w="2484" w:type="dxa"/>
+          </w:tcPr>
+          <w:p>
+            <w:r/>
+          </w:p>
+        </w:tc>
+      </w:tr>
+      <w:tr>
+        <w:tc>
+          <w:tcPr>
+            <w:tcW w:w="2484" w:type="dxa"/>
+          </w:tcPr>
+          <w:p>
+            <w:r>
+              <w:t>Envío y pago de electricista por emergencia</w:t>
+            </w:r>
+          </w:p>
+        </w:tc>
+        <w:tc>
+          <w:tcPr>
+            <w:tcW w:w="2484" w:type="dxa"/>
+          </w:tcPr>
+          <w:p>
+            <w:r/>
+          </w:p>
+        </w:tc>
+        <w:tc>
+          <w:tcPr>
+            <w:tcW w:w="2484" w:type="dxa"/>
+          </w:tcPr>
+          <w:p>
+            <w:r/>
+          </w:p>
+        </w:tc>
+        <w:tc>
+          <w:tcPr>
+            <w:tcW w:w="2484" w:type="dxa"/>
+          </w:tcPr>
+          <w:p>
+            <w:r/>
+          </w:p>
+        </w:tc>
+      </w:tr>
+      <w:tr>
+        <w:tc>
+          <w:tcPr>
+            <w:tcW w:w="2484" w:type="dxa"/>
+          </w:tcPr>
+          <w:p>
+            <w:r>
+              <w:t>Envío y pago de vidriero por emergencia</w:t>
+            </w:r>
+          </w:p>
+        </w:tc>
+        <w:tc>
+          <w:tcPr>
+            <w:tcW w:w="2484" w:type="dxa"/>
+          </w:tcPr>
+          <w:p>
+            <w:r/>
+          </w:p>
+        </w:tc>
+        <w:tc>
+          <w:tcPr>
+            <w:tcW w:w="2484" w:type="dxa"/>
+          </w:tcPr>
+          <w:p>
+            <w:r/>
+          </w:p>
+        </w:tc>
+        <w:tc>
+          <w:tcPr>
+            <w:tcW w:w="2484" w:type="dxa"/>
+          </w:tcPr>
+          <w:p>
+            <w:r/>
+          </w:p>
+        </w:tc>
+      </w:tr>
+      <w:tr>
+        <w:tc>
+          <w:tcPr>
+            <w:tcW w:w="2484" w:type="dxa"/>
+          </w:tcPr>
+          <w:p>
+            <w:r>
+              <w:t>Reparación filtraciones y humedades</w:t>
+            </w:r>
+          </w:p>
+        </w:tc>
+        <w:tc>
+          <w:tcPr>
+            <w:tcW w:w="2484" w:type="dxa"/>
+          </w:tcPr>
+          <w:p>
+            <w:r/>
+          </w:p>
+        </w:tc>
+        <w:tc>
+          <w:tcPr>
+            <w:tcW w:w="2484" w:type="dxa"/>
+          </w:tcPr>
+          <w:p>
+            <w:r/>
+          </w:p>
+        </w:tc>
+        <w:tc>
+          <w:tcPr>
+            <w:tcW w:w="2484" w:type="dxa"/>
+          </w:tcPr>
+          <w:p>
+            <w:r/>
+          </w:p>
+        </w:tc>
+      </w:tr>
+      <w:tr>
+        <w:tc>
+          <w:tcPr>
+            <w:tcW w:w="2484" w:type="dxa"/>
+          </w:tcPr>
+          <w:p>
+            <w:r>
+              <w:t>Servicios complementarios telefónicos</w:t>
+            </w:r>
+          </w:p>
+        </w:tc>
+        <w:tc>
+          <w:tcPr>
+            <w:tcW w:w="2484" w:type="dxa"/>
+          </w:tcPr>
+          <w:p>
+            <w:r/>
+          </w:p>
+        </w:tc>
+        <w:tc>
+          <w:tcPr>
+            <w:tcW w:w="2484" w:type="dxa"/>
+          </w:tcPr>
+          <w:p>
+            <w:r/>
+          </w:p>
+        </w:tc>
+        <w:tc>
+          <w:tcPr>
+            <w:tcW w:w="2484" w:type="dxa"/>
+          </w:tcPr>
+          <w:p>
+            <w:r/>
+          </w:p>
+        </w:tc>
+      </w:tr>
+      <w:tr>
+        <w:tc>
+          <w:tcPr>
+            <w:tcW w:w="2484" w:type="dxa"/>
+          </w:tcPr>
+          <w:p>
+            <w:r>
+              <w:t>Información, referencias y coordinación área privada</w:t>
+            </w:r>
+          </w:p>
+        </w:tc>
+        <w:tc>
+          <w:tcPr>
+            <w:tcW w:w="2484" w:type="dxa"/>
+          </w:tcPr>
+          <w:p>
+            <w:r/>
+          </w:p>
+        </w:tc>
+        <w:tc>
+          <w:tcPr>
+            <w:tcW w:w="2484" w:type="dxa"/>
+          </w:tcPr>
+          <w:p>
+            <w:r/>
+          </w:p>
+        </w:tc>
+        <w:tc>
+          <w:tcPr>
+            <w:tcW w:w="2484" w:type="dxa"/>
+          </w:tcPr>
+          <w:p>
+            <w:r/>
+          </w:p>
+        </w:tc>
+      </w:tr>
+    </w:tbl>
     <w:p>
       <w:pPr>
         <w:rPr>

</xml_diff>